<commit_message>
Batch scritps + CPH User Stories
</commit_message>
<xml_diff>
--- a/CPFR_VDS_CPH_Docs/TPM/CPFR_User_Stories-MVP_R2.docx
+++ b/CPFR_VDS_CPH_Docs/TPM/CPFR_User_Stories-MVP_R2.docx
@@ -495,6 +495,7 @@
           <w:b/>
           <w:bCs/>
         </w:rPr>
+        <w:lastRenderedPageBreak/>
         <w:t>ISM controls external to CPH for MVP:</w:t>
       </w:r>
       <w:r>
@@ -872,6 +873,7 @@
         <w:spacing w:before="120" w:after="120" w:line="264" w:lineRule="auto"/>
       </w:pPr>
       <w:r>
+        <w:lastRenderedPageBreak/>
         <w:t>Navigation structure scoped to MVP. Vendor path: CPH navigation (Vendor Scorecard → CPFR) → 'Admin or Reports' fork → Reports branch leads to the CPFR Data Viewer; Admin branch leads to Vendor Admin (Role-Based). Both the Vendor Admin and the external Chewy TM Admin tool write to the Vendor Contact Database, which feeds the Automated Report Generator/Emailer. The Chewy TM Admin tool is External — it operates as the Streamlit-in-Snowflake tool outside CPH, not as a CPH page.</w:t>
       </w:r>
     </w:p>
@@ -970,6 +972,7 @@
         <w:rPr>
           <w:noProof/>
         </w:rPr>
+        <w:lastRenderedPageBreak/>
         <w:drawing>
           <wp:inline distT="0" distB="0" distL="0" distR="0" wp14:anchorId="1DA38FBF" wp14:editId="1DA38FC0">
             <wp:extent cx="6667500" cy="4657725"/>
@@ -1057,6 +1060,7 @@
         <w:rPr>
           <w:noProof/>
         </w:rPr>
+        <w:lastRenderedPageBreak/>
         <w:drawing>
           <wp:inline distT="0" distB="0" distL="0" distR="0" wp14:anchorId="1DA38FC1" wp14:editId="1DA38FC2">
             <wp:extent cx="3619500" cy="4286250"/>
@@ -1257,6 +1261,7 @@
         </w:numPr>
       </w:pPr>
       <w:r>
+        <w:lastRenderedPageBreak/>
         <w:t>Email delivery management through CPH</w:t>
       </w:r>
     </w:p>
@@ -1515,6 +1520,7 @@
           <w:b/>
           <w:bCs/>
         </w:rPr>
+        <w:lastRenderedPageBreak/>
         <w:t>Excludes:</w:t>
       </w:r>
       <w:r>
@@ -1844,6 +1850,7 @@
         </w:numPr>
       </w:pPr>
       <w:r>
+        <w:lastRenderedPageBreak/>
         <w:t>Template (tier) assignment per vendor is read from the existing tier-selection lookup table in Snowflake — the same table used by the email report system. CPH reads this directly from Snowflake. No CPH-native admin UI is required for MVP.</w:t>
       </w:r>
     </w:p>
@@ -2654,6 +2661,7 @@
                 <w:sz w:val="18"/>
                 <w:szCs w:val="18"/>
               </w:rPr>
+              <w:lastRenderedPageBreak/>
               <w:t>CPH Viewport Wireframe (.png)</w:t>
             </w:r>
           </w:p>
@@ -4344,7 +4352,7 @@
       <w:footerReference w:type="default" r:id="rId15"/>
       <w:pgSz w:w="12240" w:h="15840"/>
       <w:pgMar w:top="720" w:right="720" w:bottom="720" w:left="720" w:header="288" w:footer="288" w:gutter="288"/>
-      <w:lnNumType w:countBy="1" w:distance="360"/>
+      <w:lnNumType w:countBy="1" w:distance="360" w:restart="continuous"/>
       <w:cols w:space="720"/>
       <w:docGrid w:linePitch="360"/>
     </w:sectPr>

</xml_diff>